<commit_message>
Sprint 22: per-line-item billing, payers, saved payment methods, estimate builder UI fixes
</commit_message>
<xml_diff>
--- a/src/templates/CHS-Change-Order-Template.docx
+++ b/src/templates/CHS-Change-Order-Template.docx
@@ -1282,11 +1282,6 @@
           <w:insideV w:val="single" w:color="auto" w:sz="4"/>
         </w:tblBorders>
       </w:tblPr>
-      <w:tblGrid>
-        <w:gridCol w:w="4500"/>
-        <w:gridCol w:w="360"/>
-        <w:gridCol w:w="4500"/>
-      </w:tblGrid>
       <w:tr>
         <w:tc>
           <w:tcPr>
@@ -1419,6 +1414,18 @@
           </w:tcPr>
           <w:p>
             <w:pPr>
+              <w:spacing w:after="0" w:before="0" w:line="800" w:lineRule="exact"/>
+            </w:pPr>
+            <w:r>
+              <w:rPr>
+                <w:sz w:val="28"/>
+                <w:szCs w:val="28"/>
+              </w:rPr>
+              <w:t xml:space="preserve"/>
+            </w:r>
+          </w:p>
+          <w:p>
+            <w:pPr>
               <w:pBdr>
                 <w:bottom w:val="single" w:color="000000" w:sz="4" w:space="1"/>
               </w:pBdr>
@@ -1667,14 +1674,12 @@
           </w:tcPr>
           <w:p>
             <w:pPr>
-              <w:pBdr>
-                <w:bottom w:val="single" w:color="000000" w:sz="4" w:space="1"/>
-              </w:pBdr>
-            </w:pPr>
-            <w:r>
-              <w:rPr>
-                <w:sz w:val="28"/>
-                <w:szCs w:val="28"/>
+              <w:spacing w:after="60" w:before="60"/>
+            </w:pPr>
+            <w:r>
+              <w:rPr>
+                <w:sz w:val="20"/>
+                <w:szCs w:val="20"/>
               </w:rPr>
               <w:t xml:space="preserve"/>
             </w:r>
@@ -1746,11 +1751,10 @@
             </w:pPr>
             <w:r>
               <w:rPr>
-                <w:rFonts w:ascii="Arial" w:cs="Arial" w:eastAsia="Arial" w:hAnsi="Arial"/>
-                <w:sz w:val="20"/>
-                <w:szCs w:val="20"/>
-              </w:rPr>
-              <w:t xml:space="preserve">Date</w:t>
+                <w:sz w:val="20"/>
+                <w:szCs w:val="20"/>
+              </w:rPr>
+              <w:t xml:space="preserve"/>
             </w:r>
           </w:p>
         </w:tc>

</xml_diff>